<commit_message>
adição de link github pages e qrcode
</commit_message>
<xml_diff>
--- a/Projeto_Forte_Vivo.docx
+++ b/Projeto_Forte_Vivo.docx
@@ -480,7 +480,7 @@
           <w:sz w:val="24"/>
           <w:szCs w:val="24"/>
         </w:rPr>
-        <w:t xml:space="preserve">O monumento foi tombado pelo IPHAN em 1950 e é guardado pelo Exército Brasileiro (6º Batalhão de Infantaria de Selva). Em dezembro de 2025, recebeu da UNESCO o status de Proteção Reforçada, que reconhece seu valor excepcional para a humanidade e exige salvaguarda prioritária em conflitos armados.</w:t>
+        <w:t xml:space="preserve">O monumento foi tombado pelo IPHAN em 1950 e é guardado pelo Exército Brasileiro (6º Batalhão de Infantaria de Selva). Em dezembro de 2025, recebeu da UNESCO o status de Proteção Reforçada, que reconhece seu valor excepcional para a humanidade e exige salvaguarda prioritária em conflitos armados (FOLHA DE PERNAMBUCO, 2025; INSTITUTO DO PATRIMÔNIO HISTÓRICO E ARTÍSTICO NACIONAL, 2023).</w:t>
       </w:r>
     </w:p>
     <w:p>
@@ -952,6 +952,21 @@
           <w:szCs w:val="20"/>
         </w:rPr>
         <w:t xml:space="preserve">Quadro 1 – Causas prováveis da baixa visitação. Fonte: elaboração da equipe.</w:t>
+      </w:r>
+    </w:p>
+    <w:p>
+      <w:pPr>
+        <w:spacing w:after="120" w:line="360"/>
+        <w:ind w:firstLine="709"/>
+        <w:jc w:val="both"/>
+      </w:pPr>
+      <w:r>
+        <w:rPr>
+          <w:rFonts w:ascii="Arial" w:cs="Arial" w:eastAsia="Arial" w:hAnsi="Arial"/>
+          <w:sz w:val="24"/>
+          <w:szCs w:val="24"/>
+        </w:rPr>
+        <w:t xml:space="preserve">Segundo o Ministério Público Federal, o Forte recebe cerca de 500 visitantes por mês, número que evidencia seu potencial turístico, e o órgão aponta estado de conservação precário, o que exige que a divulgação caminhe junto com a preservação (MINISTÉRIO PÚBLICO FEDERAL, 2025).</w:t>
       </w:r>
     </w:p>
     <w:p>
@@ -3158,9 +3173,9 @@
           <w:sz w:val="24"/>
           <w:szCs w:val="24"/>
         </w:rPr>
-        <w:t xml:space="preserve">Endereço da versão de demonstração: </w:t>
-      </w:r>
-      <w:hyperlink w:history="1" r:id="rId2w5boo2zyfarsklm4uihm">
+        <w:t xml:space="preserve">Endereço do site: </w:t>
+      </w:r>
+      <w:hyperlink w:history="1" r:id="rIdfg1yft-2txin5xrlkmojh">
         <w:r>
           <w:rPr>
             <w:rFonts w:ascii="Arial" w:cs="Arial" w:eastAsia="Arial" w:hAnsi="Arial"/>
@@ -3168,9 +3183,72 @@
             <w:sz w:val="24"/>
             <w:szCs w:val="24"/>
           </w:rPr>
-          <w:t xml:space="preserve">https://claude.ai/artifact/Pof8K7Qnqkk7jKgFo3X6pu</w:t>
+          <w:t xml:space="preserve">https://limadev27.github.io/Projeto-forte-vivo/</w:t>
         </w:r>
       </w:hyperlink>
+    </w:p>
+    <w:p>
+      <w:pPr>
+        <w:spacing w:after="60" w:before="120"/>
+        <w:jc w:val="center"/>
+      </w:pPr>
+      <w:r>
+        <w:drawing>
+          <wp:inline distT="0" distB="0" distL="0" distR="0">
+            <wp:extent cx="1333500" cy="1333500"/>
+            <wp:effectExtent t="0" r="0" b="0" l="0"/>
+            <wp:docPr id="1" name="qr" descr="QR Code para o site Visite o Forte" title="QR Code"/>
+            <wp:cNvGraphicFramePr>
+              <a:graphicFrameLocks xmlns:a="http://schemas.openxmlformats.org/drawingml/2006/main" noChangeAspect="1"/>
+            </wp:cNvGraphicFramePr>
+            <a:graphic xmlns:a="http://schemas.openxmlformats.org/drawingml/2006/main">
+              <a:graphicData uri="http://schemas.openxmlformats.org/drawingml/2006/picture">
+                <pic:pic xmlns:pic="http://schemas.openxmlformats.org/drawingml/2006/picture">
+                  <pic:nvPicPr>
+                    <pic:cNvPr id="0" name="" descr=""/>
+                    <pic:cNvPicPr>
+                      <a:picLocks noChangeAspect="1" noChangeArrowheads="1"/>
+                    </pic:cNvPicPr>
+                  </pic:nvPicPr>
+                  <pic:blipFill>
+                    <a:blip r:embed="rId8" cstate="none"/>
+                    <a:srcRect/>
+                    <a:stretch>
+                      <a:fillRect/>
+                    </a:stretch>
+                  </pic:blipFill>
+                  <pic:spPr bwMode="auto">
+                    <a:xfrm>
+                      <a:off x="0" y="0"/>
+                      <a:ext cx="1333500" cy="1333500"/>
+                    </a:xfrm>
+                    <a:prstGeom prst="rect">
+                      <a:avLst/>
+                    </a:prstGeom>
+                  </pic:spPr>
+                </pic:pic>
+              </a:graphicData>
+            </a:graphic>
+          </wp:inline>
+        </w:drawing>
+      </w:r>
+    </w:p>
+    <w:p>
+      <w:pPr>
+        <w:spacing w:after="200" w:line="260"/>
+        <w:ind w:firstLine="0"/>
+        <w:jc w:val="center"/>
+      </w:pPr>
+      <w:r>
+        <w:rPr>
+          <w:rFonts w:ascii="Arial" w:cs="Arial" w:eastAsia="Arial" w:hAnsi="Arial"/>
+          <w:i/>
+          <w:iCs/>
+          <w:sz w:val="20"/>
+          <w:szCs w:val="20"/>
+        </w:rPr>
+        <w:t xml:space="preserve">Figura 1 – QR Code de acesso ao site. Fonte: elaboração da equipe.</w:t>
+      </w:r>
     </w:p>
     <w:p>
       <w:pPr>
@@ -7175,6 +7253,103 @@
                 <w:sz w:val="19"/>
                 <w:szCs w:val="19"/>
               </w:rPr>
+              <w:t xml:space="preserve">Visitantes do Forte</w:t>
+            </w:r>
+          </w:p>
+        </w:tc>
+        <w:tc>
+          <w:tcPr>
+            <w:tcW w:type="dxa" w:w="3000"/>
+            <w:tcBorders>
+              <w:top w:val="single" w:color="999999" w:sz="4"/>
+              <w:left w:val="single" w:color="999999" w:sz="4"/>
+              <w:bottom w:val="single" w:color="999999" w:sz="4"/>
+              <w:right w:val="single" w:color="999999" w:sz="4"/>
+            </w:tcBorders>
+            <w:tcMar>
+              <w:top w:type="dxa" w:w="60"/>
+              <w:left w:type="dxa" w:w="100"/>
+              <w:bottom w:type="dxa" w:w="60"/>
+              <w:right w:type="dxa" w:w="100"/>
+            </w:tcMar>
+          </w:tcPr>
+          <w:p>
+            <w:pPr>
+              <w:spacing w:after="40" w:line="260"/>
+            </w:pPr>
+            <w:r>
+              <w:rPr>
+                <w:rFonts w:ascii="Arial" w:cs="Arial" w:eastAsia="Arial" w:hAnsi="Arial"/>
+                <w:sz w:val="19"/>
+                <w:szCs w:val="19"/>
+              </w:rPr>
+              <w:t xml:space="preserve">Superar a linha de base de cerca de 500 por mês (MPF, 2025)</w:t>
+            </w:r>
+          </w:p>
+        </w:tc>
+        <w:tc>
+          <w:tcPr>
+            <w:tcW w:type="dxa" w:w="3071"/>
+            <w:tcBorders>
+              <w:top w:val="single" w:color="999999" w:sz="4"/>
+              <w:left w:val="single" w:color="999999" w:sz="4"/>
+              <w:bottom w:val="single" w:color="999999" w:sz="4"/>
+              <w:right w:val="single" w:color="999999" w:sz="4"/>
+            </w:tcBorders>
+            <w:tcMar>
+              <w:top w:type="dxa" w:w="60"/>
+              <w:left w:type="dxa" w:w="100"/>
+              <w:bottom w:type="dxa" w:w="60"/>
+              <w:right w:type="dxa" w:w="100"/>
+            </w:tcMar>
+          </w:tcPr>
+          <w:p>
+            <w:pPr>
+              <w:spacing w:after="40" w:line="260"/>
+            </w:pPr>
+            <w:r>
+              <w:rPr>
+                <w:rFonts w:ascii="Arial" w:cs="Arial" w:eastAsia="Arial" w:hAnsi="Arial"/>
+                <w:sz w:val="19"/>
+                <w:szCs w:val="19"/>
+              </w:rPr>
+              <w:t xml:space="preserve">Registro de visitas da administração do Forte</w:t>
+            </w:r>
+          </w:p>
+        </w:tc>
+      </w:tr>
+      <w:tr>
+        <w:trPr>
+          <w:cantSplit/>
+        </w:trPr>
+        <w:tc>
+          <w:tcPr>
+            <w:tcW w:type="dxa" w:w="3000"/>
+            <w:tcBorders>
+              <w:top w:val="single" w:color="999999" w:sz="4"/>
+              <w:left w:val="single" w:color="999999" w:sz="4"/>
+              <w:bottom w:val="single" w:color="999999" w:sz="4"/>
+              <w:right w:val="single" w:color="999999" w:sz="4"/>
+            </w:tcBorders>
+            <w:tcMar>
+              <w:top w:type="dxa" w:w="60"/>
+              <w:left w:type="dxa" w:w="100"/>
+              <w:bottom w:type="dxa" w:w="60"/>
+              <w:right w:type="dxa" w:w="100"/>
+            </w:tcMar>
+          </w:tcPr>
+          <w:p>
+            <w:pPr>
+              <w:spacing w:after="40" w:line="260"/>
+            </w:pPr>
+            <w:r>
+              <w:rPr>
+                <w:rFonts w:ascii="Arial" w:cs="Arial" w:eastAsia="Arial" w:hAnsi="Arial"/>
+                <w:b/>
+                <w:bCs/>
+                <w:sz w:val="19"/>
+                <w:szCs w:val="19"/>
+              </w:rPr>
               <w:t xml:space="preserve">Acessos ao site</w:t>
             </w:r>
           </w:p>
@@ -7982,6 +8157,73 @@
                 <w:sz w:val="19"/>
                 <w:szCs w:val="19"/>
               </w:rPr>
+              <w:t xml:space="preserve">Estado de conservação precário do monumento</w:t>
+            </w:r>
+          </w:p>
+        </w:tc>
+        <w:tc>
+          <w:tcPr>
+            <w:tcW w:type="dxa" w:w="5471"/>
+            <w:tcBorders>
+              <w:top w:val="single" w:color="999999" w:sz="4"/>
+              <w:left w:val="single" w:color="999999" w:sz="4"/>
+              <w:bottom w:val="single" w:color="999999" w:sz="4"/>
+              <w:right w:val="single" w:color="999999" w:sz="4"/>
+            </w:tcBorders>
+            <w:tcMar>
+              <w:top w:type="dxa" w:w="60"/>
+              <w:left w:type="dxa" w:w="100"/>
+              <w:bottom w:type="dxa" w:w="60"/>
+              <w:right w:type="dxa" w:w="100"/>
+            </w:tcMar>
+          </w:tcPr>
+          <w:p>
+            <w:pPr>
+              <w:spacing w:after="40" w:line="260"/>
+            </w:pPr>
+            <w:r>
+              <w:rPr>
+                <w:rFonts w:ascii="Arial" w:cs="Arial" w:eastAsia="Arial" w:hAnsi="Arial"/>
+                <w:sz w:val="19"/>
+                <w:szCs w:val="19"/>
+              </w:rPr>
+              <w:t xml:space="preserve">Divulgar com responsabilidade, orientar os visitantes e apoiar as ações do IPHAN e do Exército</w:t>
+            </w:r>
+          </w:p>
+        </w:tc>
+      </w:tr>
+      <w:tr>
+        <w:trPr>
+          <w:cantSplit/>
+        </w:trPr>
+        <w:tc>
+          <w:tcPr>
+            <w:tcW w:type="dxa" w:w="3600"/>
+            <w:tcBorders>
+              <w:top w:val="single" w:color="999999" w:sz="4"/>
+              <w:left w:val="single" w:color="999999" w:sz="4"/>
+              <w:bottom w:val="single" w:color="999999" w:sz="4"/>
+              <w:right w:val="single" w:color="999999" w:sz="4"/>
+            </w:tcBorders>
+            <w:tcMar>
+              <w:top w:type="dxa" w:w="60"/>
+              <w:left w:type="dxa" w:w="100"/>
+              <w:bottom w:type="dxa" w:w="60"/>
+              <w:right w:type="dxa" w:w="100"/>
+            </w:tcMar>
+          </w:tcPr>
+          <w:p>
+            <w:pPr>
+              <w:spacing w:after="40" w:line="260"/>
+            </w:pPr>
+            <w:r>
+              <w:rPr>
+                <w:rFonts w:ascii="Arial" w:cs="Arial" w:eastAsia="Arial" w:hAnsi="Arial"/>
+                <w:b/>
+                <w:bCs/>
+                <w:sz w:val="19"/>
+                <w:szCs w:val="19"/>
+              </w:rPr>
               <w:t xml:space="preserve">Dependência de poucos voluntários</w:t>
             </w:r>
           </w:p>
@@ -8084,19 +8326,92 @@
     </w:p>
     <w:p>
       <w:pPr>
-        <w:spacing w:after="120" w:line="360"/>
+        <w:spacing w:after="240" w:line="240"/>
         <w:ind w:firstLine="0"/>
         <w:jc w:val="left"/>
       </w:pPr>
       <w:r>
         <w:rPr>
           <w:rFonts w:ascii="Arial" w:cs="Arial" w:eastAsia="Arial" w:hAnsi="Arial"/>
-          <w:i/>
-          <w:iCs/>
           <w:sz w:val="24"/>
           <w:szCs w:val="24"/>
         </w:rPr>
-        <w:t xml:space="preserve">[Inserir as referências consultadas, conforme a norma exigida pelo professor (ABNT), com link e data de acesso. Sugestões de fontes oficiais: portal do IPHAN (Real Forte Príncipe da Beira), site da UNESCO sobre Proteção Reforçada de bens culturais, Exército Brasileiro (6º BIS) e Prefeitura de Costa Marques.]</w:t>
+        <w:t xml:space="preserve">BARCELOS, Giovani da Silva. Forte Príncipe da Beira: conhecimento, valoração e preservação. 2018. Dissertação (Mestrado em Preservação do Patrimônio Cultural) – Instituto do Patrimônio Histórico e Artístico Nacional, Rio de Janeiro, 2018. Disponível em: https://www.gov.br/iphan/pt-br/unidades-especiais/centro-lucio-costa/mestrado-profissional/dissertacoes-1/ficha-tecnica-forte-principe-da-beira-conhecimento-valoracao-e-preservacao. Acesso em: 6 out. 2026.</w:t>
+      </w:r>
+    </w:p>
+    <w:p>
+      <w:pPr>
+        <w:spacing w:after="240" w:line="240"/>
+        <w:ind w:firstLine="0"/>
+        <w:jc w:val="left"/>
+      </w:pPr>
+      <w:r>
+        <w:rPr>
+          <w:rFonts w:ascii="Arial" w:cs="Arial" w:eastAsia="Arial" w:hAnsi="Arial"/>
+          <w:sz w:val="24"/>
+          <w:szCs w:val="24"/>
+        </w:rPr>
+        <w:t xml:space="preserve">FOLHA DE PERNAMBUCO. Unesco: Memorial da Resistência em SP é bem sob proteção reforçada. Recife, dez. 2025. Disponível em: https://www.folhape.com.br/cultura/unesco-memorial-da-resistencia-em-sp-e-bem-sob-protecao-reforcada/454560/. Acesso em: 6 out. 2026.</w:t>
+      </w:r>
+    </w:p>
+    <w:p>
+      <w:pPr>
+        <w:spacing w:after="240" w:line="240"/>
+        <w:ind w:firstLine="0"/>
+        <w:jc w:val="left"/>
+      </w:pPr>
+      <w:r>
+        <w:rPr>
+          <w:rFonts w:ascii="Arial" w:cs="Arial" w:eastAsia="Arial" w:hAnsi="Arial"/>
+          <w:sz w:val="24"/>
+          <w:szCs w:val="24"/>
+        </w:rPr>
+        <w:t xml:space="preserve">INSTITUTO DO PATRIMÔNIO HISTÓRICO E ARTÍSTICO NACIONAL. História da Amazônia é destaque nas escavações do Real Forte Príncipe da Beira (RO). Brasília, DF: Iphan, 2023. Disponível em: https://www.gov.br/iphan/pt-br/assuntos/noticias/historia-da-amazonia-e-destaque-nas-escavacoes-do-real-forte-principe-da-beira-ro. Acesso em: 6 out. 2026.</w:t>
+      </w:r>
+    </w:p>
+    <w:p>
+      <w:pPr>
+        <w:spacing w:after="240" w:line="240"/>
+        <w:ind w:firstLine="0"/>
+        <w:jc w:val="left"/>
+      </w:pPr>
+      <w:r>
+        <w:rPr>
+          <w:rFonts w:ascii="Arial" w:cs="Arial" w:eastAsia="Arial" w:hAnsi="Arial"/>
+          <w:sz w:val="24"/>
+          <w:szCs w:val="24"/>
+        </w:rPr>
+        <w:t xml:space="preserve">MINISTÉRIO PÚBLICO FEDERAL. MPF inspeciona Real Forte Príncipe da Beira e reforça a importância da preservação do patrimônio histórico em Rondônia. Porto Velho: MPF, 25 set. 2025. Disponível em: https://www.mpf.mp.br/o-mpf/unidades/pr-ro/noticias/mpf-inspeciona-real-forte-principe-da-beira-e-reforca-a-importancia-da-preservacao-do-patrimonio-historico-em-rondonia. Acesso em: 6 out. 2026.</w:t>
+      </w:r>
+    </w:p>
+    <w:p>
+      <w:pPr>
+        <w:spacing w:after="240" w:line="240"/>
+        <w:ind w:firstLine="0"/>
+        <w:jc w:val="left"/>
+      </w:pPr>
+      <w:r>
+        <w:rPr>
+          <w:rFonts w:ascii="Arial" w:cs="Arial" w:eastAsia="Arial" w:hAnsi="Arial"/>
+          <w:sz w:val="24"/>
+          <w:szCs w:val="24"/>
+        </w:rPr>
+        <w:t xml:space="preserve">PORTAL AMAZÔNIA. Real Forte Príncipe da Beira, em Rondônia, recebe proteção internacional da Unesco. [S. l.], dez. 2025. Disponível em: https://portalamazonia.com/cultura/real-forte-principe-beira-unesco/. Acesso em: 6 out. 2026.</w:t>
+      </w:r>
+    </w:p>
+    <w:p>
+      <w:pPr>
+        <w:spacing w:after="240" w:line="240"/>
+        <w:ind w:firstLine="0"/>
+        <w:jc w:val="left"/>
+      </w:pPr>
+      <w:r>
+        <w:rPr>
+          <w:rFonts w:ascii="Arial" w:cs="Arial" w:eastAsia="Arial" w:hAnsi="Arial"/>
+          <w:sz w:val="24"/>
+          <w:szCs w:val="24"/>
+        </w:rPr>
+        <w:t xml:space="preserve">PORTAL AMAZÔNIA. Real Forte Príncipe da Beira completa 75 anos de tombamento pelo Iphan. [S. l.], 2025. Disponível em: https://portalamazonia.com/cultura/real-forte-principe-da-beira-75/. Acesso em: 6 out. 2026.</w:t>
       </w:r>
     </w:p>
     <w:sectPr>

</xml_diff>